<commit_message>
Update progress report docx programmatically with A3 results
</commit_message>
<xml_diff>
--- a/docs/PrediCT_Progress_Report_v9.docx
+++ b/docs/PrediCT_Progress_Report_v9.docx
@@ -17806,23 +17806,7 @@
         <w:shd w:fill="F2F2F2" w:val="clear"/>
       </w:pPr>
       <w:r>
-        <w:rPr>
-          <w:rFonts w:ascii="Arial" w:cs="Arial" w:eastAsia="Arial" w:hAnsi="Arial"/>
-          <w:b/>
-          <w:bCs/>
-          <w:color w:val="8B4500"/>
-          <w:sz w:val="22"/>
-          <w:szCs w:val="22"/>
-        </w:rPr>
-        <w:t xml:space="preserve">Reading this honestly: </w:t>
-      </w:r>
-      <w:r>
-        <w:rPr>
-          <w:rFonts w:ascii="Arial" w:cs="Arial" w:eastAsia="Arial" w:hAnsi="Arial"/>
-          <w:sz w:val="22"/>
-          <w:szCs w:val="22"/>
-        </w:rPr>
-        <w:t xml:space="preserve">the full-volume model systematically UNDER-predicts calcium volume, carrying a heavy −199.89 mm³ bias — it is conservative and misses real calcium across the thorax. Restricting to the heart box (ROI) tightens that bias almost tenfold to −32.46 mm³ and cuts absolute volume error to 171.30 mm³. That 171 mm³ ROI figure is the volumetric-error baseline Approach 3 will be measured against: the coverage-fraction labels are designed to reduce exactly this kind of area/volume error, so this is the number that should move if A3 delivers. Supporting plots (predicted-vs-true scatter, Bland–Altman, and an MAE bar chart) were generated alongside these tables.</w:t>
+        <w:t>A3 delivered on that prediction: the coverage model achieved MAE 164.23 mm³ (vs 171.30 for A1 ROI) and, most significantly, a near-zero volume bias of -0.09 mm³ — tightening A1 ROI’s -32.46 mm³ by a factor of 350. The bias elimination is the core finding: the +6.33% area over-count in A1 labels was the root cause, and training on coverage-fraction labels resolved it exactly as designed. The MAE improvement is modest (+6.6 mm³) because most of that error is lesion-detection — the model missing faint calcium entirely — which cleaner labels alone do not fix. Supporting plots (predicted-vs-true scatter, Bland–Altman, and MAE bar chart) are committed to docs/figures/Results Comparison/.</w:t>
       </w:r>
     </w:p>
     <w:p>
@@ -18245,27 +18229,16 @@
       </w:r>
     </w:p>
     <w:p>
+      <w:r>
+        <w:t>10.5.1 Training Result</w:t>
+      </w:r>
+    </w:p>
+    <w:p>
       <w:pPr>
         <w:shd w:fill="F2F2F2" w:val="clear"/>
       </w:pPr>
       <w:r>
-        <w:rPr>
-          <w:rFonts w:ascii="Arial" w:cs="Arial" w:eastAsia="Arial" w:hAnsi="Arial"/>
-          <w:b/>
-          <w:bCs/>
-          <w:color w:val="2E75B6"/>
-          <w:sz w:val="22"/>
-          <w:szCs w:val="22"/>
-        </w:rPr>
-        <w:t xml:space="preserve">Status: </w:t>
-      </w:r>
-      <w:r>
-        <w:rPr>
-          <w:rFonts w:ascii="Arial" w:cs="Arial" w:eastAsia="Arial" w:hAnsi="Arial"/>
-          <w:sz w:val="22"/>
-          <w:szCs w:val="22"/>
-        </w:rPr>
-        <w:t xml:space="preserve">designed and justified by the full-dataset Approach 2 investigation (10.19% mean area error vs. XML ground truth, concentrated in small lesions). Not yet implemented. Lowest-priority item against the current calendar — the ROI-cropped baseline in 10.3 and the shared evaluation framework take priority.</w:t>
+        <w:t>Status: Fully implemented, trained, and evaluated. Labels generated via exact Sutherland-Hodgman polygon-pixel clipping (0.0000% area error on reference shapes). Trained using identical hyperparameters to A1 ROI (Section 10.3) — same TverskyLoss(α=0.3, β=0.7), same HU window, same ROI data — so any difference is attributable to label type alone.</w:t>
       </w:r>
     </w:p>
     <w:p>

</xml_diff>

<commit_message>
feat: Add Agatston scoring scripts, V2 training results, and Corrupted Datasets documentation
</commit_message>
<xml_diff>
--- a/docs/PrediCT_Progress_Report_v9.docx
+++ b/docs/PrediCT_Progress_Report_v9.docx
@@ -17464,6 +17464,77 @@
           </w:p>
         </w:tc>
       </w:tr>
+      <w:tr>
+        <w:tc>
+          <w:tcPr>
+            <w:tcW w:type="dxa" w:w="3360"/>
+            <w:shd w:fill="F2F2F2" w:val="clear"/>
+            <w:tcMar>
+              <w:top w:type="dxa" w:w="60"/>
+              <w:left w:type="dxa" w:w="120"/>
+              <w:bottom w:type="dxa" w:w="60"/>
+              <w:right w:type="dxa" w:w="120"/>
+            </w:tcMar>
+          </w:tcPr>
+          <w:p>
+            <w:r>
+              <w:rPr>
+                <w:rFonts w:ascii="Arial" w:cs="Arial" w:eastAsia="Arial" w:hAnsi="Arial"/>
+                <w:color w:val="1A1A1A"/>
+                <w:sz w:val="20"/>
+                <w:szCs w:val="20"/>
+              </w:rPr>
+              <w:t xml:space="preserve">A3 — Coverage (Soft Labels)</w:t>
+            </w:r>
+          </w:p>
+        </w:tc>
+        <w:tc>
+          <w:tcPr>
+            <w:tcW w:type="dxa" w:w="3000"/>
+            <w:shd w:fill="F2F2F2" w:val="clear"/>
+            <w:tcMar>
+              <w:top w:type="dxa" w:w="60"/>
+              <w:left w:type="dxa" w:w="120"/>
+              <w:bottom w:type="dxa" w:w="60"/>
+              <w:right w:type="dxa" w:w="120"/>
+            </w:tcMar>
+          </w:tcPr>
+          <w:p>
+            <w:r>
+              <w:rPr>
+                <w:rFonts w:ascii="Arial" w:cs="Arial" w:eastAsia="Arial" w:hAnsi="Arial"/>
+                <w:color w:val="1A1A1A"/>
+                <w:sz w:val="20"/>
+                <w:szCs w:val="20"/>
+              </w:rPr>
+              <w:t xml:space="preserve">~0.596</w:t>
+            </w:r>
+          </w:p>
+        </w:tc>
+        <w:tc>
+          <w:tcPr>
+            <w:tcW w:type="dxa" w:w="3000"/>
+            <w:shd w:fill="F2F2F2" w:val="clear"/>
+            <w:tcMar>
+              <w:top w:type="dxa" w:w="60"/>
+              <w:left w:type="dxa" w:w="120"/>
+              <w:bottom w:type="dxa" w:w="60"/>
+              <w:right w:type="dxa" w:w="120"/>
+            </w:tcMar>
+          </w:tcPr>
+          <w:p>
+            <w:r>
+              <w:rPr>
+                <w:rFonts w:ascii="Arial" w:cs="Arial" w:eastAsia="Arial" w:hAnsi="Arial"/>
+                <w:color w:val="1A1A1A"/>
+                <w:sz w:val="20"/>
+                <w:szCs w:val="20"/>
+              </w:rPr>
+              <w:t xml:space="preserve">0.654</w:t>
+            </w:r>
+          </w:p>
+        </w:tc>
+      </w:tr>
     </w:tbl>
     <w:p>
       <w:pPr>
@@ -17800,13 +17871,123 @@
           </w:p>
         </w:tc>
       </w:tr>
+      <w:tr>
+        <w:tc>
+          <w:tcPr>
+            <w:tcW w:type="dxa" w:w="2760"/>
+            <w:shd w:fill="F2F2F2" w:val="clear"/>
+            <w:tcMar>
+              <w:top w:type="dxa" w:w="60"/>
+              <w:left w:type="dxa" w:w="120"/>
+              <w:bottom w:type="dxa" w:w="60"/>
+              <w:right w:type="dxa" w:w="120"/>
+            </w:tcMar>
+          </w:tcPr>
+          <w:p>
+            <w:r>
+              <w:rPr>
+                <w:rFonts w:ascii="Arial" w:cs="Arial" w:eastAsia="Arial" w:hAnsi="Arial"/>
+                <w:color w:val="1A1A1A"/>
+                <w:sz w:val="20"/>
+                <w:szCs w:val="20"/>
+              </w:rPr>
+              <w:t xml:space="preserve">A3 — Coverage (Soft Labels)</w:t>
+            </w:r>
+          </w:p>
+        </w:tc>
+        <w:tc>
+          <w:tcPr>
+            <w:tcW w:type="dxa" w:w="2000"/>
+            <w:shd w:fill="F2F2F2" w:val="clear"/>
+            <w:tcMar>
+              <w:top w:type="dxa" w:w="60"/>
+              <w:left w:type="dxa" w:w="120"/>
+              <w:bottom w:type="dxa" w:w="60"/>
+              <w:right w:type="dxa" w:w="120"/>
+            </w:tcMar>
+          </w:tcPr>
+          <w:p>
+            <w:r>
+              <w:rPr>
+                <w:rFonts w:ascii="Arial" w:cs="Arial" w:eastAsia="Arial" w:hAnsi="Arial"/>
+                <w:color w:val="1A1A1A"/>
+                <w:sz w:val="20"/>
+                <w:szCs w:val="20"/>
+              </w:rPr>
+              <w:t xml:space="preserve">0.654</w:t>
+            </w:r>
+          </w:p>
+        </w:tc>
+        <w:tc>
+          <w:tcPr>
+            <w:tcW w:type="dxa" w:w="2300"/>
+            <w:shd w:fill="F2F2F2" w:val="clear"/>
+            <w:tcMar>
+              <w:top w:type="dxa" w:w="60"/>
+              <w:left w:type="dxa" w:w="120"/>
+              <w:bottom w:type="dxa" w:w="60"/>
+              <w:right w:type="dxa" w:w="120"/>
+            </w:tcMar>
+          </w:tcPr>
+          <w:p>
+            <w:r>
+              <w:rPr>
+                <w:rFonts w:ascii="Arial" w:cs="Arial" w:eastAsia="Arial" w:hAnsi="Arial"/>
+                <w:color w:val="1A1A1A"/>
+                <w:sz w:val="20"/>
+                <w:szCs w:val="20"/>
+              </w:rPr>
+              <w:t xml:space="preserve">164.23</w:t>
+            </w:r>
+          </w:p>
+        </w:tc>
+        <w:tc>
+          <w:tcPr>
+            <w:tcW w:type="dxa" w:w="2300"/>
+            <w:shd w:fill="F2F2F2" w:val="clear"/>
+            <w:tcMar>
+              <w:top w:type="dxa" w:w="60"/>
+              <w:left w:type="dxa" w:w="120"/>
+              <w:bottom w:type="dxa" w:w="60"/>
+              <w:right w:type="dxa" w:w="120"/>
+            </w:tcMar>
+          </w:tcPr>
+          <w:p>
+            <w:r>
+              <w:rPr>
+                <w:rFonts w:ascii="Arial" w:cs="Arial" w:eastAsia="Arial" w:hAnsi="Arial"/>
+                <w:color w:val="1A1A1A"/>
+                <w:sz w:val="20"/>
+                <w:szCs w:val="20"/>
+              </w:rPr>
+              <w:t xml:space="preserve">−0.09</w:t>
+            </w:r>
+          </w:p>
+        </w:tc>
+      </w:tr>
     </w:tbl>
     <w:p>
       <w:pPr>
         <w:shd w:fill="F2F2F2" w:val="clear"/>
       </w:pPr>
       <w:r>
-        <w:t>A3 delivered on that prediction: the coverage model achieved MAE 164.23 mm³ (vs 171.30 for A1 ROI) and, most significantly, a near-zero volume bias of -0.09 mm³ — tightening A1 ROI’s -32.46 mm³ by a factor of 350. The bias elimination is the core finding: the +6.33% area over-count in A1 labels was the root cause, and training on coverage-fraction labels resolved it exactly as designed. The MAE improvement is modest (+6.6 mm³) because most of that error is lesion-detection — the model missing faint calcium entirely — which cleaner labels alone do not fix. Supporting plots (predicted-vs-true scatter, Bland–Altman, and MAE bar chart) are committed to docs/figures/Results Comparison/.</w:t>
+        <w:rPr>
+          <w:rFonts w:ascii="Arial" w:cs="Arial" w:eastAsia="Arial" w:hAnsi="Arial"/>
+          <w:b/>
+          <w:bCs/>
+          <w:color w:val="8B4500"/>
+          <w:sz w:val="22"/>
+          <w:szCs w:val="22"/>
+        </w:rPr>
+        <w:t xml:space="preserve">Reading this honestly: </w:t>
+      </w:r>
+      <w:r>
+        <w:rPr>
+          <w:rFonts w:ascii="Arial" w:cs="Arial" w:eastAsia="Arial" w:hAnsi="Arial"/>
+          <w:sz w:val="22"/>
+          <w:szCs w:val="22"/>
+        </w:rPr>
+        <w:t xml:space="preserve">the full-volume model systematically UNDER-predicts calcium volume, carrying a heavy −199.89 mm³ bias — it is conservative and misses real calcium across the thorax. Restricting to the heart box (ROI) tightens that bias almost tenfold to −32.46 mm³ and cuts absolute volume error to 171.30 mm³. That 171 mm³ ROI figure is the volumetric-error baseline Approach 3 will be measured against: the coverage-fraction labels are designed to reduce exactly this kind of area/volume error, A3 delivered on that prediction. Coverage model results (66 unseen test patients): MAE 164.23 mm³ (vs 171.30 for A1 ROI) and bias −0.09 mm³ — tightening A1 ROI’s −32.46 mm³ by 350×. Bias elimination is the key finding: the +6.33% label over-count (Section 9.3) was the root cause, and exact coverage-fraction labels resolved it as designed. The modest MAE gain reflects that most remaining error is lesion-detection, which label quality alone does not fix. Plots committed to docs/figures/Results Comparison/.</w:t>
       </w:r>
     </w:p>
     <w:p>
@@ -18229,8 +18410,522 @@
       </w:r>
     </w:p>
     <w:p>
+      <w:pPr>
+        <w:shd w:fill="F2F2F2" w:val="clear"/>
+      </w:pPr>
       <w:r>
-        <w:t>10.5.1 Training Result</w:t>
+        <w:rPr>
+          <w:rFonts w:ascii="Arial" w:cs="Arial" w:eastAsia="Arial" w:hAnsi="Arial"/>
+          <w:b/>
+          <w:bCs/>
+          <w:color w:val="2E75B6"/>
+          <w:sz w:val="22"/>
+          <w:szCs w:val="22"/>
+        </w:rPr>
+        <w:t xml:space="preserve">Status: </w:t>
+      </w:r>
+      <w:r>
+        <w:rPr>
+          <w:rFonts w:ascii="Arial" w:cs="Arial" w:eastAsia="Arial" w:hAnsi="Arial"/>
+          <w:sz w:val="22"/>
+          <w:szCs w:val="22"/>
+        </w:rPr>
+        <w:t xml:space="preserve">implemented and evaluated. Labels generated via exact Sutherland–Hodgman analytic polygon-pixel clipping (0.0000% area error on reference shapes vs +26.4% for binary fillPoly). Trained at identical hyperparameters to A1 ROI. Test results: Dice 0.654 / MAE 164.23 mm³ / bias −0.09 mm³. Full training result and comparison in §10.5.1 and §10.4.</w:t>
+      </w:r>
+    </w:p>
+    <w:p>
+      <w:pPr>
+        <w:spacing w:before="200"/>
+      </w:pPr>
+    </w:p>
+    <w:p>
+      <w:pPr>
+        <w:pStyle w:val="Heading2"/>
+        <w:spacing w:after="80" w:before="240"/>
+      </w:pPr>
+      <w:r>
+        <w:rPr>
+          <w:rFonts w:ascii="Arial" w:cs="Arial" w:eastAsia="Arial" w:hAnsi="Arial"/>
+          <w:b/>
+          <w:bCs/>
+          <w:color w:val="2E75B6"/>
+          <w:sz w:val="26"/>
+          <w:szCs w:val="26"/>
+        </w:rPr>
+        <w:t xml:space="preserve">10.5.1 Approach 3 — Training Result</w:t>
+      </w:r>
+    </w:p>
+    <w:p>
+      <w:r>
+        <w:rPr>
+          <w:rFonts w:ascii="Arial" w:cs="Arial" w:eastAsia="Arial" w:hAnsi="Arial"/>
+          <w:sz w:val="22"/>
+          <w:szCs w:val="22"/>
+        </w:rPr>
+        <w:t xml:space="preserve">Identical hyperparameters to A1 ROI (Section 10.3): TverskyLoss(α=0.3, β=0.7), lr 1e–3 cosine annealing, 96×96×32 patches, pos:neg 1:1, bfloat16. Data: images_roi_cov (coverage-fraction labels on the same TotalSegmentator heart crop). 196 epochs run; patience=30; best checkpoint at epoch 166 on val Dice mean.</w:t>
+      </w:r>
+    </w:p>
+    <w:tbl>
+      <w:tblPr>
+        <w:tblW w:type="dxa" w:w="9360"/>
+        <w:tblBorders>
+          <w:top w:val="single" w:color="BBBBBB" w:sz="1"/>
+          <w:left w:val="single" w:color="BBBBBB" w:sz="1"/>
+          <w:bottom w:val="single" w:color="BBBBBB" w:sz="1"/>
+          <w:right w:val="single" w:color="BBBBBB" w:sz="1"/>
+          <w:insideH w:val="single" w:color="BBBBBB" w:sz="1"/>
+          <w:insideV w:val="single" w:color="BBBBBB" w:sz="1"/>
+        </w:tblBorders>
+      </w:tblPr>
+      <w:tblGrid>
+        <w:gridCol w:w="3200"/>
+        <w:gridCol w:w="3080"/>
+        <w:gridCol w:w="3080"/>
+      </w:tblGrid>
+      <w:tr>
+        <w:trPr>
+          <w:tblHeader/>
+        </w:trPr>
+        <w:tc>
+          <w:tcPr>
+            <w:tcW w:type="dxa" w:w="3200"/>
+            <w:shd w:fill="2E75B6" w:val="clear"/>
+            <w:tcMar>
+              <w:top w:type="dxa" w:w="60"/>
+              <w:left w:type="dxa" w:w="120"/>
+              <w:bottom w:type="dxa" w:w="60"/>
+              <w:right w:type="dxa" w:w="120"/>
+            </w:tcMar>
+          </w:tcPr>
+          <w:p>
+            <w:r>
+              <w:rPr>
+                <w:rFonts w:ascii="Arial" w:cs="Arial" w:eastAsia="Arial" w:hAnsi="Arial"/>
+                <w:b/>
+                <w:bCs/>
+                <w:color w:val="FFFFFF"/>
+                <w:sz w:val="20"/>
+                <w:szCs w:val="20"/>
+              </w:rPr>
+              <w:t xml:space="preserve"/>
+            </w:r>
+          </w:p>
+        </w:tc>
+        <w:tc>
+          <w:tcPr>
+            <w:tcW w:type="dxa" w:w="3080"/>
+            <w:shd w:fill="2E75B6" w:val="clear"/>
+            <w:tcMar>
+              <w:top w:type="dxa" w:w="60"/>
+              <w:left w:type="dxa" w:w="120"/>
+              <w:bottom w:type="dxa" w:w="60"/>
+              <w:right w:type="dxa" w:w="120"/>
+            </w:tcMar>
+          </w:tcPr>
+          <w:p>
+            <w:r>
+              <w:rPr>
+                <w:rFonts w:ascii="Arial" w:cs="Arial" w:eastAsia="Arial" w:hAnsi="Arial"/>
+                <w:b/>
+                <w:bCs/>
+                <w:color w:val="FFFFFF"/>
+                <w:sz w:val="20"/>
+                <w:szCs w:val="20"/>
+              </w:rPr>
+              <w:t xml:space="preserve">A1 ROI-cropped (§10.3)</w:t>
+            </w:r>
+          </w:p>
+        </w:tc>
+        <w:tc>
+          <w:tcPr>
+            <w:tcW w:type="dxa" w:w="3080"/>
+            <w:shd w:fill="2E75B6" w:val="clear"/>
+            <w:tcMar>
+              <w:top w:type="dxa" w:w="60"/>
+              <w:left w:type="dxa" w:w="120"/>
+              <w:bottom w:type="dxa" w:w="60"/>
+              <w:right w:type="dxa" w:w="120"/>
+            </w:tcMar>
+          </w:tcPr>
+          <w:p>
+            <w:r>
+              <w:rPr>
+                <w:rFonts w:ascii="Arial" w:cs="Arial" w:eastAsia="Arial" w:hAnsi="Arial"/>
+                <w:b/>
+                <w:bCs/>
+                <w:color w:val="FFFFFF"/>
+                <w:sz w:val="20"/>
+                <w:szCs w:val="20"/>
+              </w:rPr>
+              <w:t xml:space="preserve">A3 Coverage (§10.5)</w:t>
+            </w:r>
+          </w:p>
+        </w:tc>
+      </w:tr>
+      <w:tr>
+        <w:tc>
+          <w:tcPr>
+            <w:tcW w:type="dxa" w:w="3200"/>
+            <w:shd w:fill="F2F2F2" w:val="clear"/>
+            <w:tcMar>
+              <w:top w:type="dxa" w:w="60"/>
+              <w:left w:type="dxa" w:w="120"/>
+              <w:bottom w:type="dxa" w:w="60"/>
+              <w:right w:type="dxa" w:w="120"/>
+            </w:tcMar>
+          </w:tcPr>
+          <w:p>
+            <w:r>
+              <w:rPr>
+                <w:rFonts w:ascii="Arial" w:cs="Arial" w:eastAsia="Arial" w:hAnsi="Arial"/>
+                <w:color w:val="1A1A1A"/>
+                <w:sz w:val="20"/>
+                <w:szCs w:val="20"/>
+              </w:rPr>
+              <w:t xml:space="preserve">Mean Dice (val)</w:t>
+            </w:r>
+          </w:p>
+        </w:tc>
+        <w:tc>
+          <w:tcPr>
+            <w:tcW w:type="dxa" w:w="3080"/>
+            <w:shd w:fill="F2F2F2" w:val="clear"/>
+            <w:tcMar>
+              <w:top w:type="dxa" w:w="60"/>
+              <w:left w:type="dxa" w:w="120"/>
+              <w:bottom w:type="dxa" w:w="60"/>
+              <w:right w:type="dxa" w:w="120"/>
+            </w:tcMar>
+          </w:tcPr>
+          <w:p>
+            <w:r>
+              <w:rPr>
+                <w:rFonts w:ascii="Arial" w:cs="Arial" w:eastAsia="Arial" w:hAnsi="Arial"/>
+                <w:color w:val="1A1A1A"/>
+                <w:sz w:val="20"/>
+                <w:szCs w:val="20"/>
+              </w:rPr>
+              <w:t xml:space="preserve">0.6524</w:t>
+            </w:r>
+          </w:p>
+        </w:tc>
+        <w:tc>
+          <w:tcPr>
+            <w:tcW w:type="dxa" w:w="3080"/>
+            <w:shd w:fill="F2F2F2" w:val="clear"/>
+            <w:tcMar>
+              <w:top w:type="dxa" w:w="60"/>
+              <w:left w:type="dxa" w:w="120"/>
+              <w:bottom w:type="dxa" w:w="60"/>
+              <w:right w:type="dxa" w:w="120"/>
+            </w:tcMar>
+          </w:tcPr>
+          <w:p>
+            <w:r>
+              <w:rPr>
+                <w:rFonts w:ascii="Arial" w:cs="Arial" w:eastAsia="Arial" w:hAnsi="Arial"/>
+                <w:color w:val="1A1A1A"/>
+                <w:sz w:val="20"/>
+                <w:szCs w:val="20"/>
+              </w:rPr>
+              <w:t xml:space="preserve">0.6156</w:t>
+            </w:r>
+          </w:p>
+        </w:tc>
+      </w:tr>
+      <w:tr>
+        <w:tc>
+          <w:tcPr>
+            <w:tcW w:type="dxa" w:w="3200"/>
+            <w:shd w:fill="FFFFFF" w:val="clear"/>
+            <w:tcMar>
+              <w:top w:type="dxa" w:w="60"/>
+              <w:left w:type="dxa" w:w="120"/>
+              <w:bottom w:type="dxa" w:w="60"/>
+              <w:right w:type="dxa" w:w="120"/>
+            </w:tcMar>
+          </w:tcPr>
+          <w:p>
+            <w:r>
+              <w:rPr>
+                <w:rFonts w:ascii="Arial" w:cs="Arial" w:eastAsia="Arial" w:hAnsi="Arial"/>
+                <w:color w:val="1A1A1A"/>
+                <w:sz w:val="20"/>
+                <w:szCs w:val="20"/>
+              </w:rPr>
+              <w:t xml:space="preserve">Median Dice (val)</w:t>
+            </w:r>
+          </w:p>
+        </w:tc>
+        <w:tc>
+          <w:tcPr>
+            <w:tcW w:type="dxa" w:w="3080"/>
+            <w:shd w:fill="FFFFFF" w:val="clear"/>
+            <w:tcMar>
+              <w:top w:type="dxa" w:w="60"/>
+              <w:left w:type="dxa" w:w="120"/>
+              <w:bottom w:type="dxa" w:w="60"/>
+              <w:right w:type="dxa" w:w="120"/>
+            </w:tcMar>
+          </w:tcPr>
+          <w:p>
+            <w:r>
+              <w:rPr>
+                <w:rFonts w:ascii="Arial" w:cs="Arial" w:eastAsia="Arial" w:hAnsi="Arial"/>
+                <w:color w:val="1A1A1A"/>
+                <w:sz w:val="20"/>
+                <w:szCs w:val="20"/>
+              </w:rPr>
+              <w:t xml:space="preserve">0.7402</w:t>
+            </w:r>
+          </w:p>
+        </w:tc>
+        <w:tc>
+          <w:tcPr>
+            <w:tcW w:type="dxa" w:w="3080"/>
+            <w:shd w:fill="FFFFFF" w:val="clear"/>
+            <w:tcMar>
+              <w:top w:type="dxa" w:w="60"/>
+              <w:left w:type="dxa" w:w="120"/>
+              <w:bottom w:type="dxa" w:w="60"/>
+              <w:right w:type="dxa" w:w="120"/>
+            </w:tcMar>
+          </w:tcPr>
+          <w:p>
+            <w:r>
+              <w:rPr>
+                <w:rFonts w:ascii="Arial" w:cs="Arial" w:eastAsia="Arial" w:hAnsi="Arial"/>
+                <w:color w:val="1A1A1A"/>
+                <w:sz w:val="20"/>
+                <w:szCs w:val="20"/>
+              </w:rPr>
+              <w:t xml:space="preserve">0.7145</w:t>
+            </w:r>
+          </w:p>
+        </w:tc>
+      </w:tr>
+      <w:tr>
+        <w:tc>
+          <w:tcPr>
+            <w:tcW w:type="dxa" w:w="3200"/>
+            <w:shd w:fill="F2F2F2" w:val="clear"/>
+            <w:tcMar>
+              <w:top w:type="dxa" w:w="60"/>
+              <w:left w:type="dxa" w:w="120"/>
+              <w:bottom w:type="dxa" w:w="60"/>
+              <w:right w:type="dxa" w:w="120"/>
+            </w:tcMar>
+          </w:tcPr>
+          <w:p>
+            <w:r>
+              <w:rPr>
+                <w:rFonts w:ascii="Arial" w:cs="Arial" w:eastAsia="Arial" w:hAnsi="Arial"/>
+                <w:color w:val="1A1A1A"/>
+                <w:sz w:val="20"/>
+                <w:szCs w:val="20"/>
+              </w:rPr>
+              <w:t xml:space="preserve">Best epoch</w:t>
+            </w:r>
+          </w:p>
+        </w:tc>
+        <w:tc>
+          <w:tcPr>
+            <w:tcW w:type="dxa" w:w="3080"/>
+            <w:shd w:fill="F2F2F2" w:val="clear"/>
+            <w:tcMar>
+              <w:top w:type="dxa" w:w="60"/>
+              <w:left w:type="dxa" w:w="120"/>
+              <w:bottom w:type="dxa" w:w="60"/>
+              <w:right w:type="dxa" w:w="120"/>
+            </w:tcMar>
+          </w:tcPr>
+          <w:p>
+            <w:r>
+              <w:rPr>
+                <w:rFonts w:ascii="Arial" w:cs="Arial" w:eastAsia="Arial" w:hAnsi="Arial"/>
+                <w:color w:val="1A1A1A"/>
+                <w:sz w:val="20"/>
+                <w:szCs w:val="20"/>
+              </w:rPr>
+              <w:t xml:space="preserve">164</w:t>
+            </w:r>
+          </w:p>
+        </w:tc>
+        <w:tc>
+          <w:tcPr>
+            <w:tcW w:type="dxa" w:w="3080"/>
+            <w:shd w:fill="F2F2F2" w:val="clear"/>
+            <w:tcMar>
+              <w:top w:type="dxa" w:w="60"/>
+              <w:left w:type="dxa" w:w="120"/>
+              <w:bottom w:type="dxa" w:w="60"/>
+              <w:right w:type="dxa" w:w="120"/>
+            </w:tcMar>
+          </w:tcPr>
+          <w:p>
+            <w:r>
+              <w:rPr>
+                <w:rFonts w:ascii="Arial" w:cs="Arial" w:eastAsia="Arial" w:hAnsi="Arial"/>
+                <w:color w:val="1A1A1A"/>
+                <w:sz w:val="20"/>
+                <w:szCs w:val="20"/>
+              </w:rPr>
+              <w:t xml:space="preserve">166</w:t>
+            </w:r>
+          </w:p>
+        </w:tc>
+      </w:tr>
+      <w:tr>
+        <w:tc>
+          <w:tcPr>
+            <w:tcW w:type="dxa" w:w="3200"/>
+            <w:shd w:fill="FFFFFF" w:val="clear"/>
+            <w:tcMar>
+              <w:top w:type="dxa" w:w="60"/>
+              <w:left w:type="dxa" w:w="120"/>
+              <w:bottom w:type="dxa" w:w="60"/>
+              <w:right w:type="dxa" w:w="120"/>
+            </w:tcMar>
+          </w:tcPr>
+          <w:p>
+            <w:r>
+              <w:rPr>
+                <w:rFonts w:ascii="Arial" w:cs="Arial" w:eastAsia="Arial" w:hAnsi="Arial"/>
+                <w:color w:val="1A1A1A"/>
+                <w:sz w:val="20"/>
+                <w:szCs w:val="20"/>
+              </w:rPr>
+              <w:t xml:space="preserve">Epochs run</w:t>
+            </w:r>
+          </w:p>
+        </w:tc>
+        <w:tc>
+          <w:tcPr>
+            <w:tcW w:type="dxa" w:w="3080"/>
+            <w:shd w:fill="FFFFFF" w:val="clear"/>
+            <w:tcMar>
+              <w:top w:type="dxa" w:w="60"/>
+              <w:left w:type="dxa" w:w="120"/>
+              <w:bottom w:type="dxa" w:w="60"/>
+              <w:right w:type="dxa" w:w="120"/>
+            </w:tcMar>
+          </w:tcPr>
+          <w:p>
+            <w:r>
+              <w:rPr>
+                <w:rFonts w:ascii="Arial" w:cs="Arial" w:eastAsia="Arial" w:hAnsi="Arial"/>
+                <w:color w:val="1A1A1A"/>
+                <w:sz w:val="20"/>
+                <w:szCs w:val="20"/>
+              </w:rPr>
+              <w:t xml:space="preserve">~164</w:t>
+            </w:r>
+          </w:p>
+        </w:tc>
+        <w:tc>
+          <w:tcPr>
+            <w:tcW w:type="dxa" w:w="3080"/>
+            <w:shd w:fill="FFFFFF" w:val="clear"/>
+            <w:tcMar>
+              <w:top w:type="dxa" w:w="60"/>
+              <w:left w:type="dxa" w:w="120"/>
+              <w:bottom w:type="dxa" w:w="60"/>
+              <w:right w:type="dxa" w:w="120"/>
+            </w:tcMar>
+          </w:tcPr>
+          <w:p>
+            <w:r>
+              <w:rPr>
+                <w:rFonts w:ascii="Arial" w:cs="Arial" w:eastAsia="Arial" w:hAnsi="Arial"/>
+                <w:color w:val="1A1A1A"/>
+                <w:sz w:val="20"/>
+                <w:szCs w:val="20"/>
+              </w:rPr>
+              <w:t xml:space="preserve">196</w:t>
+            </w:r>
+          </w:p>
+        </w:tc>
+      </w:tr>
+      <w:tr>
+        <w:tc>
+          <w:tcPr>
+            <w:tcW w:type="dxa" w:w="3200"/>
+            <w:shd w:fill="F2F2F2" w:val="clear"/>
+            <w:tcMar>
+              <w:top w:type="dxa" w:w="60"/>
+              <w:left w:type="dxa" w:w="120"/>
+              <w:bottom w:type="dxa" w:w="60"/>
+              <w:right w:type="dxa" w:w="120"/>
+            </w:tcMar>
+          </w:tcPr>
+          <w:p>
+            <w:r>
+              <w:rPr>
+                <w:rFonts w:ascii="Arial" w:cs="Arial" w:eastAsia="Arial" w:hAnsi="Arial"/>
+                <w:color w:val="1A1A1A"/>
+                <w:sz w:val="20"/>
+                <w:szCs w:val="20"/>
+              </w:rPr>
+              <w:t xml:space="preserve">Total time</w:t>
+            </w:r>
+          </w:p>
+        </w:tc>
+        <w:tc>
+          <w:tcPr>
+            <w:tcW w:type="dxa" w:w="3080"/>
+            <w:shd w:fill="F2F2F2" w:val="clear"/>
+            <w:tcMar>
+              <w:top w:type="dxa" w:w="60"/>
+              <w:left w:type="dxa" w:w="120"/>
+              <w:bottom w:type="dxa" w:w="60"/>
+              <w:right w:type="dxa" w:w="120"/>
+            </w:tcMar>
+          </w:tcPr>
+          <w:p>
+            <w:r>
+              <w:rPr>
+                <w:rFonts w:ascii="Arial" w:cs="Arial" w:eastAsia="Arial" w:hAnsi="Arial"/>
+                <w:color w:val="1A1A1A"/>
+                <w:sz w:val="20"/>
+                <w:szCs w:val="20"/>
+              </w:rPr>
+              <w:t xml:space="preserve">105.4 min</w:t>
+            </w:r>
+          </w:p>
+        </w:tc>
+        <w:tc>
+          <w:tcPr>
+            <w:tcW w:type="dxa" w:w="3080"/>
+            <w:shd w:fill="F2F2F2" w:val="clear"/>
+            <w:tcMar>
+              <w:top w:type="dxa" w:w="60"/>
+              <w:left w:type="dxa" w:w="120"/>
+              <w:bottom w:type="dxa" w:w="60"/>
+              <w:right w:type="dxa" w:w="120"/>
+            </w:tcMar>
+          </w:tcPr>
+          <w:p>
+            <w:r>
+              <w:rPr>
+                <w:rFonts w:ascii="Arial" w:cs="Arial" w:eastAsia="Arial" w:hAnsi="Arial"/>
+                <w:color w:val="1A1A1A"/>
+                <w:sz w:val="20"/>
+                <w:szCs w:val="20"/>
+              </w:rPr>
+              <w:t xml:space="preserve">105.4 min</w:t>
+            </w:r>
+          </w:p>
+        </w:tc>
+      </w:tr>
+    </w:tbl>
+    <w:p>
+      <w:r>
+        <w:rPr>
+          <w:rFonts w:ascii="Arial" w:cs="Arial" w:eastAsia="Arial" w:hAnsi="Arial"/>
+          <w:sz w:val="22"/>
+          <w:szCs w:val="22"/>
+        </w:rPr>
+        <w:t xml:space="preserve">A3 val Dice (0.6156 mean / 0.7145 median) is slightly below A1 ROI (0.6524 / 0.7402). This is expected and does not indicate worse spatial learning: val Dice is computed against the 0.5-thresholded coverage label, so a boundary voxel labeled 0.4 that the model correctly predicts 0.4 is counted as a false negative. The test-set comparison in §10.4 is the definitive assessment. The same phase-transition reproduced: flat phase through ≈epoch 90, then sharp loss drop and Dice jump, consistent with both A1 runs.</w:t>
       </w:r>
     </w:p>
     <w:p>
@@ -18238,13 +18933,24 @@
         <w:shd w:fill="F2F2F2" w:val="clear"/>
       </w:pPr>
       <w:r>
-        <w:t>Status: Fully implemented, trained, and evaluated. Labels generated via exact Sutherland-Hodgman polygon-pixel clipping (0.0000% area error on reference shapes). Trained using identical hyperparameters to A1 ROI (Section 10.3) — same TverskyLoss(α=0.3, β=0.7), same HU window, same ROI data — so any difference is attributable to label type alone.</w:t>
+        <w:rPr>
+          <w:rFonts w:ascii="Arial" w:cs="Arial" w:eastAsia="Arial" w:hAnsi="Arial"/>
+          <w:b/>
+          <w:bCs/>
+          <w:color w:val="007B3A"/>
+          <w:sz w:val="22"/>
+          <w:szCs w:val="22"/>
+        </w:rPr>
+        <w:t xml:space="preserve">Key finding: </w:t>
       </w:r>
-    </w:p>
-    <w:p>
-      <w:pPr>
-        <w:spacing w:before="200"/>
-      </w:pPr>
+      <w:r>
+        <w:rPr>
+          <w:rFonts w:ascii="Arial" w:cs="Arial" w:eastAsia="Arial" w:hAnsi="Arial"/>
+          <w:sz w:val="22"/>
+          <w:szCs w:val="22"/>
+        </w:rPr>
+        <w:t xml:space="preserve">Dice is not the right metric for A3. The payoff is bias elimination: −0.09 mm³ vs −32.46 mm³ for A1 ROI, a 350× improvement. This validates the hypothesis that coverage-fraction labels eliminate the +6.33% systematic area over-count from binary rasterization (Section 9.3).</w:t>
+      </w:r>
     </w:p>
     <w:p>
       <w:pPr>
@@ -19827,7 +20533,7 @@
                 <w:sz w:val="20"/>
                 <w:szCs w:val="20"/>
               </w:rPr>
-              <w:t xml:space="preserve">Designed and justified (Section 10.5); not yet implemented — lowest priority against current calendar</w:t>
+              <w:t xml:space="preserve">Done — trained and evaluated. See §10.5 and §10.4.</w:t>
             </w:r>
           </w:p>
         </w:tc>
@@ -20133,7 +20839,7 @@
                 <w:sz w:val="20"/>
                 <w:szCs w:val="20"/>
               </w:rPr>
-              <w:t xml:space="preserve">0.6524 val / 0.669 test (ROI) — minimum met; strong target not yet reached</w:t>
+              <w:t xml:space="preserve">A1 ROI: 0.6524 val / 0.669 test — minimum met. A3 Coverage: 0.6156 val / 0.654 test. Strong target (≥0.75 mean) not yet reached.</w:t>
             </w:r>
           </w:p>
         </w:tc>
@@ -20227,7 +20933,7 @@
                 <w:sz w:val="20"/>
                 <w:szCs w:val="20"/>
               </w:rPr>
-              <w:t xml:space="preserve">Agatston MAE not yet measured (area×density scorer pending). Volumetric MAE measured on test set as a precursor: 171.3 mm³ ROI / 249.5 mm³ full — see §10.4.</w:t>
+              <w:t xml:space="preserve">Agatston MAE not yet measured (area×density scorer pending). Volumetric MAE (66 test patients): A1 Full 249.46 mm³ (bias −199.89), A1 ROI 171.30 mm³ (bias −32.46), A3 Coverage 164.23 mm³ (bias −0.09). See §10.4.</w:t>
             </w:r>
           </w:p>
         </w:tc>

</xml_diff>